<commit_message>
docs: add final .docx reports with screenshots
- Fixed title page formatting (ГОСТ)
- Added 8 screenshots of running services
- Font: Times New Roman 14pt, proper margins
- Screenshots from browser: frontend, 6 APIs, admin panel
</commit_message>
<xml_diff>
--- a/docs/Отчет_по_автоматизированным_тестам.docx
+++ b/docs/Отчет_по_автоматизированным_тестам.docx
@@ -4,46 +4,36 @@
   <w:body>
     <w:p>
       <w:pPr>
-        <w:spacing w:line="240" w:lineRule="auto" w:before="0" w:after="0"/>
+        <w:spacing w:before="0" w:after="0"/>
+        <w:ind w:firstLine="0"/>
         <w:jc w:val="both"/>
       </w:pPr>
-      <w:r>
-        <w:rPr>
-          <w:rFonts w:ascii="Times New Roman" w:hAnsi="Times New Roman" w:cs="Times New Roman" w:eastAsia="Times New Roman"/>
-          <w:b w:val="0"/>
-          <w:sz w:val="28"/>
-        </w:rPr>
-      </w:r>
     </w:p>
     <w:p>
       <w:pPr>
-        <w:spacing w:line="240" w:lineRule="auto" w:before="0" w:after="0"/>
+        <w:spacing w:before="0" w:after="0"/>
+        <w:ind w:firstLine="0"/>
         <w:jc w:val="both"/>
       </w:pPr>
-      <w:r>
-        <w:rPr>
-          <w:rFonts w:ascii="Times New Roman" w:hAnsi="Times New Roman" w:cs="Times New Roman" w:eastAsia="Times New Roman"/>
-          <w:b w:val="0"/>
-          <w:sz w:val="28"/>
-        </w:rPr>
-      </w:r>
     </w:p>
     <w:p>
       <w:pPr>
-        <w:spacing w:line="240" w:lineRule="auto" w:before="0" w:after="0"/>
+        <w:spacing w:before="0" w:after="0"/>
+        <w:ind w:firstLine="0"/>
         <w:jc w:val="both"/>
       </w:pPr>
-      <w:r>
-        <w:rPr>
-          <w:rFonts w:ascii="Times New Roman" w:hAnsi="Times New Roman" w:cs="Times New Roman" w:eastAsia="Times New Roman"/>
-          <w:b w:val="0"/>
-          <w:sz w:val="28"/>
-        </w:rPr>
-      </w:r>
     </w:p>
     <w:p>
       <w:pPr>
-        <w:spacing w:line="240" w:lineRule="auto" w:before="0" w:after="0"/>
+        <w:spacing w:before="0" w:after="0"/>
+        <w:ind w:firstLine="0"/>
+        <w:jc w:val="both"/>
+      </w:pPr>
+    </w:p>
+    <w:p>
+      <w:pPr>
+        <w:spacing w:before="0" w:after="0"/>
+        <w:ind w:firstLine="0"/>
         <w:jc w:val="center"/>
       </w:pPr>
       <w:r>
@@ -57,7 +47,8 @@
     </w:p>
     <w:p>
       <w:pPr>
-        <w:spacing w:line="240" w:lineRule="auto" w:before="0" w:after="0"/>
+        <w:spacing w:before="0" w:after="0"/>
+        <w:ind w:firstLine="0"/>
         <w:jc w:val="center"/>
       </w:pPr>
       <w:r>
@@ -71,7 +62,8 @@
     </w:p>
     <w:p>
       <w:pPr>
-        <w:spacing w:line="240" w:lineRule="auto" w:before="0" w:after="0"/>
+        <w:spacing w:before="0" w:after="0"/>
+        <w:ind w:firstLine="0"/>
         <w:jc w:val="center"/>
       </w:pPr>
       <w:r>
@@ -85,59 +77,50 @@
     </w:p>
     <w:p>
       <w:pPr>
-        <w:spacing w:line="240" w:lineRule="auto" w:before="0" w:after="0"/>
+        <w:spacing w:before="0" w:after="0"/>
+        <w:ind w:firstLine="0"/>
         <w:jc w:val="both"/>
       </w:pPr>
-      <w:r>
-        <w:rPr>
-          <w:rFonts w:ascii="Times New Roman" w:hAnsi="Times New Roman" w:cs="Times New Roman" w:eastAsia="Times New Roman"/>
-          <w:b w:val="0"/>
-          <w:sz w:val="28"/>
-        </w:rPr>
-      </w:r>
     </w:p>
     <w:p>
       <w:pPr>
-        <w:spacing w:line="240" w:lineRule="auto" w:before="0" w:after="0"/>
+        <w:spacing w:before="0" w:after="0"/>
+        <w:ind w:firstLine="0"/>
         <w:jc w:val="both"/>
       </w:pPr>
-      <w:r>
-        <w:rPr>
-          <w:rFonts w:ascii="Times New Roman" w:hAnsi="Times New Roman" w:cs="Times New Roman" w:eastAsia="Times New Roman"/>
-          <w:b w:val="0"/>
-          <w:sz w:val="28"/>
-        </w:rPr>
-      </w:r>
     </w:p>
     <w:p>
       <w:pPr>
-        <w:spacing w:line="240" w:lineRule="auto" w:before="0" w:after="0"/>
+        <w:spacing w:before="0" w:after="0"/>
+        <w:ind w:firstLine="0"/>
         <w:jc w:val="both"/>
       </w:pPr>
-      <w:r>
-        <w:rPr>
-          <w:rFonts w:ascii="Times New Roman" w:hAnsi="Times New Roman" w:cs="Times New Roman" w:eastAsia="Times New Roman"/>
-          <w:b w:val="0"/>
-          <w:sz w:val="28"/>
-        </w:rPr>
-      </w:r>
     </w:p>
     <w:p>
       <w:pPr>
-        <w:spacing w:line="240" w:lineRule="auto" w:before="0" w:after="0"/>
+        <w:spacing w:before="0" w:after="0"/>
+        <w:ind w:firstLine="0"/>
         <w:jc w:val="both"/>
       </w:pPr>
-      <w:r>
-        <w:rPr>
-          <w:rFonts w:ascii="Times New Roman" w:hAnsi="Times New Roman" w:cs="Times New Roman" w:eastAsia="Times New Roman"/>
-          <w:b w:val="0"/>
-          <w:sz w:val="28"/>
-        </w:rPr>
-      </w:r>
     </w:p>
     <w:p>
       <w:pPr>
-        <w:spacing w:line="240" w:lineRule="auto" w:before="0" w:after="0"/>
+        <w:spacing w:before="0" w:after="0"/>
+        <w:ind w:firstLine="0"/>
+        <w:jc w:val="both"/>
+      </w:pPr>
+    </w:p>
+    <w:p>
+      <w:pPr>
+        <w:spacing w:before="0" w:after="0"/>
+        <w:ind w:firstLine="0"/>
+        <w:jc w:val="both"/>
+      </w:pPr>
+    </w:p>
+    <w:p>
+      <w:pPr>
+        <w:spacing w:before="0" w:after="0"/>
+        <w:ind w:firstLine="0"/>
         <w:jc w:val="center"/>
       </w:pPr>
       <w:r>
@@ -151,7 +134,8 @@
     </w:p>
     <w:p>
       <w:pPr>
-        <w:spacing w:line="240" w:lineRule="auto" w:before="0" w:after="0"/>
+        <w:spacing w:before="0" w:after="0"/>
+        <w:ind w:firstLine="0"/>
         <w:jc w:val="center"/>
       </w:pPr>
       <w:r>
@@ -165,7 +149,8 @@
     </w:p>
     <w:p>
       <w:pPr>
-        <w:spacing w:line="240" w:lineRule="auto" w:before="0" w:after="0"/>
+        <w:spacing w:before="0" w:after="0"/>
+        <w:ind w:firstLine="0"/>
         <w:jc w:val="center"/>
       </w:pPr>
       <w:r>
@@ -179,85 +164,57 @@
     </w:p>
     <w:p>
       <w:pPr>
-        <w:spacing w:line="240" w:lineRule="auto" w:before="0" w:after="0"/>
+        <w:spacing w:before="0" w:after="0"/>
+        <w:ind w:firstLine="0"/>
         <w:jc w:val="both"/>
       </w:pPr>
-      <w:r>
-        <w:rPr>
-          <w:rFonts w:ascii="Times New Roman" w:hAnsi="Times New Roman" w:cs="Times New Roman" w:eastAsia="Times New Roman"/>
-          <w:b w:val="0"/>
-          <w:sz w:val="28"/>
-        </w:rPr>
-      </w:r>
     </w:p>
     <w:p>
       <w:pPr>
-        <w:spacing w:line="240" w:lineRule="auto" w:before="0" w:after="0"/>
+        <w:spacing w:before="0" w:after="0"/>
+        <w:ind w:firstLine="0"/>
         <w:jc w:val="both"/>
       </w:pPr>
-      <w:r>
-        <w:rPr>
-          <w:rFonts w:ascii="Times New Roman" w:hAnsi="Times New Roman" w:cs="Times New Roman" w:eastAsia="Times New Roman"/>
-          <w:b w:val="0"/>
-          <w:sz w:val="28"/>
-        </w:rPr>
-      </w:r>
     </w:p>
     <w:p>
       <w:pPr>
-        <w:spacing w:line="240" w:lineRule="auto" w:before="0" w:after="0"/>
+        <w:spacing w:before="0" w:after="0"/>
+        <w:ind w:firstLine="0"/>
         <w:jc w:val="both"/>
       </w:pPr>
-      <w:r>
-        <w:rPr>
-          <w:rFonts w:ascii="Times New Roman" w:hAnsi="Times New Roman" w:cs="Times New Roman" w:eastAsia="Times New Roman"/>
-          <w:b w:val="0"/>
-          <w:sz w:val="28"/>
-        </w:rPr>
-      </w:r>
     </w:p>
     <w:p>
       <w:pPr>
-        <w:spacing w:line="240" w:lineRule="auto" w:before="0" w:after="0"/>
+        <w:spacing w:before="0" w:after="0"/>
+        <w:ind w:firstLine="0"/>
         <w:jc w:val="both"/>
       </w:pPr>
-      <w:r>
-        <w:rPr>
-          <w:rFonts w:ascii="Times New Roman" w:hAnsi="Times New Roman" w:cs="Times New Roman" w:eastAsia="Times New Roman"/>
-          <w:b w:val="0"/>
-          <w:sz w:val="28"/>
-        </w:rPr>
-      </w:r>
     </w:p>
     <w:p>
       <w:pPr>
-        <w:spacing w:line="240" w:lineRule="auto" w:before="0" w:after="0"/>
+        <w:spacing w:before="0" w:after="0"/>
+        <w:ind w:firstLine="0"/>
         <w:jc w:val="both"/>
       </w:pPr>
-      <w:r>
-        <w:rPr>
-          <w:rFonts w:ascii="Times New Roman" w:hAnsi="Times New Roman" w:cs="Times New Roman" w:eastAsia="Times New Roman"/>
-          <w:b w:val="0"/>
-          <w:sz w:val="28"/>
-        </w:rPr>
-      </w:r>
     </w:p>
     <w:p>
       <w:pPr>
-        <w:spacing w:line="240" w:lineRule="auto" w:before="0" w:after="0"/>
+        <w:spacing w:before="0" w:after="0"/>
+        <w:ind w:firstLine="0"/>
         <w:jc w:val="both"/>
       </w:pPr>
-      <w:r>
-        <w:rPr>
-          <w:rFonts w:ascii="Times New Roman" w:hAnsi="Times New Roman" w:cs="Times New Roman" w:eastAsia="Times New Roman"/>
-          <w:b w:val="0"/>
-          <w:sz w:val="28"/>
-        </w:rPr>
-      </w:r>
     </w:p>
     <w:p>
       <w:pPr>
-        <w:spacing w:line="240" w:lineRule="auto" w:before="0" w:after="0"/>
+        <w:spacing w:before="0" w:after="0"/>
+        <w:ind w:firstLine="0"/>
+        <w:jc w:val="both"/>
+      </w:pPr>
+    </w:p>
+    <w:p>
+      <w:pPr>
+        <w:spacing w:before="0" w:after="0"/>
+        <w:ind w:firstLine="0"/>
         <w:jc w:val="center"/>
       </w:pPr>
       <w:r>
@@ -276,7 +233,8 @@
     </w:p>
     <w:p>
       <w:pPr>
-        <w:spacing w:line="240" w:lineRule="auto" w:before="0" w:after="240"/>
+        <w:spacing w:before="0" w:after="240"/>
+        <w:ind w:firstLine="0"/>
         <w:jc w:val="center"/>
       </w:pPr>
       <w:r>
@@ -290,7 +248,8 @@
     </w:p>
     <w:p>
       <w:pPr>
-        <w:spacing w:line="240" w:lineRule="auto" w:before="0" w:after="120"/>
+        <w:spacing w:before="0" w:after="120"/>
+        <w:ind w:firstLine="0"/>
         <w:jc w:val="both"/>
       </w:pPr>
       <w:r>
@@ -304,7 +263,8 @@
     </w:p>
     <w:p>
       <w:pPr>
-        <w:spacing w:line="240" w:lineRule="auto" w:before="0" w:after="120"/>
+        <w:spacing w:before="0" w:after="120"/>
+        <w:ind w:firstLine="0"/>
         <w:jc w:val="both"/>
       </w:pPr>
       <w:r>
@@ -318,7 +278,8 @@
     </w:p>
     <w:p>
       <w:pPr>
-        <w:spacing w:line="240" w:lineRule="auto" w:before="0" w:after="120"/>
+        <w:spacing w:before="0" w:after="120"/>
+        <w:ind w:firstLine="0"/>
         <w:jc w:val="both"/>
       </w:pPr>
       <w:r>
@@ -332,7 +293,8 @@
     </w:p>
     <w:p>
       <w:pPr>
-        <w:spacing w:line="240" w:lineRule="auto" w:before="0" w:after="120"/>
+        <w:spacing w:before="0" w:after="120"/>
+        <w:ind w:firstLine="0"/>
         <w:jc w:val="both"/>
       </w:pPr>
       <w:r>
@@ -346,7 +308,8 @@
     </w:p>
     <w:p>
       <w:pPr>
-        <w:spacing w:line="240" w:lineRule="auto" w:before="0" w:after="120"/>
+        <w:spacing w:before="0" w:after="120"/>
+        <w:ind w:firstLine="0"/>
         <w:jc w:val="both"/>
       </w:pPr>
       <w:r>
@@ -365,7 +328,8 @@
     </w:p>
     <w:p>
       <w:pPr>
-        <w:spacing w:line="240" w:lineRule="auto" w:before="240" w:after="240"/>
+        <w:spacing w:before="240" w:after="240"/>
+        <w:ind w:firstLine="0"/>
         <w:jc w:val="left"/>
       </w:pPr>
       <w:r>
@@ -379,7 +343,7 @@
     </w:p>
     <w:p>
       <w:pPr>
-        <w:spacing w:line="240" w:lineRule="auto" w:before="0" w:after="0"/>
+        <w:spacing w:before="0" w:after="0"/>
         <w:ind w:firstLine="709"/>
         <w:jc w:val="both"/>
       </w:pPr>
@@ -394,7 +358,8 @@
     </w:p>
     <w:p>
       <w:pPr>
-        <w:spacing w:line="240" w:lineRule="auto" w:before="240" w:after="240"/>
+        <w:spacing w:before="240" w:after="240"/>
+        <w:ind w:firstLine="0"/>
         <w:jc w:val="left"/>
       </w:pPr>
       <w:r>
@@ -408,7 +373,7 @@
     </w:p>
     <w:p>
       <w:pPr>
-        <w:spacing w:line="240" w:lineRule="auto" w:before="0" w:after="0"/>
+        <w:spacing w:before="0" w:after="0"/>
         <w:ind w:firstLine="709"/>
         <w:jc w:val="both"/>
       </w:pPr>
@@ -423,7 +388,8 @@
     </w:p>
     <w:p>
       <w:pPr>
-        <w:spacing w:line="240" w:lineRule="auto" w:before="240" w:after="240"/>
+        <w:spacing w:before="240" w:after="240"/>
+        <w:ind w:firstLine="0"/>
         <w:jc w:val="left"/>
       </w:pPr>
       <w:r>
@@ -437,7 +403,7 @@
     </w:p>
     <w:p>
       <w:pPr>
-        <w:spacing w:line="240" w:lineRule="auto" w:before="0" w:after="0"/>
+        <w:spacing w:before="0" w:after="0"/>
         <w:ind w:firstLine="709"/>
         <w:jc w:val="both"/>
       </w:pPr>
@@ -452,7 +418,8 @@
     </w:p>
     <w:p>
       <w:pPr>
-        <w:spacing w:line="240" w:lineRule="auto" w:before="240" w:after="240"/>
+        <w:spacing w:before="240" w:after="240"/>
+        <w:ind w:firstLine="0"/>
         <w:jc w:val="left"/>
       </w:pPr>
       <w:r>
@@ -466,7 +433,7 @@
     </w:p>
     <w:p>
       <w:pPr>
-        <w:spacing w:line="240" w:lineRule="auto" w:before="0" w:after="0"/>
+        <w:spacing w:before="0" w:after="0"/>
         <w:ind w:firstLine="709"/>
         <w:jc w:val="both"/>
       </w:pPr>
@@ -481,16 +448,10 @@
     </w:p>
     <w:p>
       <w:pPr>
-        <w:spacing w:line="240" w:lineRule="auto" w:before="0" w:after="0"/>
+        <w:spacing w:before="0" w:after="120"/>
+        <w:ind w:firstLine="0"/>
         <w:jc w:val="both"/>
       </w:pPr>
-      <w:r>
-        <w:rPr>
-          <w:rFonts w:ascii="Times New Roman" w:hAnsi="Times New Roman" w:cs="Times New Roman" w:eastAsia="Times New Roman"/>
-          <w:b w:val="0"/>
-          <w:sz w:val="28"/>
-        </w:rPr>
-      </w:r>
     </w:p>
     <w:tbl>
       <w:tblPr>
@@ -508,7 +469,6 @@
         <w:tc>
           <w:tcPr>
             <w:tcW w:type="dxa" w:w="3230"/>
-            <w:vAlign w:val="center"/>
           </w:tcPr>
           <w:p>
             <w:pPr>
@@ -516,7 +476,7 @@
             </w:pPr>
             <w:r>
               <w:rPr>
-                <w:rFonts w:ascii="Times New Roman" w:hAnsi="Times New Roman"/>
+                <w:rFonts w:ascii="Times New Roman" w:hAnsi="Times New Roman" w:cs="Times New Roman" w:eastAsia="Times New Roman"/>
                 <w:b/>
                 <w:sz w:val="24"/>
               </w:rPr>
@@ -527,7 +487,6 @@
         <w:tc>
           <w:tcPr>
             <w:tcW w:type="dxa" w:w="3230"/>
-            <w:vAlign w:val="center"/>
           </w:tcPr>
           <w:p>
             <w:pPr>
@@ -535,7 +494,7 @@
             </w:pPr>
             <w:r>
               <w:rPr>
-                <w:rFonts w:ascii="Times New Roman" w:hAnsi="Times New Roman"/>
+                <w:rFonts w:ascii="Times New Roman" w:hAnsi="Times New Roman" w:cs="Times New Roman" w:eastAsia="Times New Roman"/>
                 <w:b/>
                 <w:sz w:val="24"/>
               </w:rPr>
@@ -546,7 +505,6 @@
         <w:tc>
           <w:tcPr>
             <w:tcW w:type="dxa" w:w="3230"/>
-            <w:vAlign w:val="center"/>
           </w:tcPr>
           <w:p>
             <w:pPr>
@@ -554,7 +512,7 @@
             </w:pPr>
             <w:r>
               <w:rPr>
-                <w:rFonts w:ascii="Times New Roman" w:hAnsi="Times New Roman"/>
+                <w:rFonts w:ascii="Times New Roman" w:hAnsi="Times New Roman" w:cs="Times New Roman" w:eastAsia="Times New Roman"/>
                 <w:b/>
                 <w:sz w:val="24"/>
               </w:rPr>
@@ -567,7 +525,6 @@
         <w:tc>
           <w:tcPr>
             <w:tcW w:type="dxa" w:w="3230"/>
-            <w:vAlign w:val="center"/>
           </w:tcPr>
           <w:p>
             <w:pPr>
@@ -575,7 +532,8 @@
             </w:pPr>
             <w:r>
               <w:rPr>
-                <w:rFonts w:ascii="Times New Roman" w:hAnsi="Times New Roman"/>
+                <w:rFonts w:ascii="Times New Roman" w:hAnsi="Times New Roman" w:cs="Times New Roman" w:eastAsia="Times New Roman"/>
+                <w:b w:val="0"/>
                 <w:sz w:val="24"/>
               </w:rPr>
               <w:t>1</w:t>
@@ -585,7 +543,6 @@
         <w:tc>
           <w:tcPr>
             <w:tcW w:type="dxa" w:w="3230"/>
-            <w:vAlign w:val="center"/>
           </w:tcPr>
           <w:p>
             <w:pPr>
@@ -593,7 +550,8 @@
             </w:pPr>
             <w:r>
               <w:rPr>
-                <w:rFonts w:ascii="Times New Roman" w:hAnsi="Times New Roman"/>
+                <w:rFonts w:ascii="Times New Roman" w:hAnsi="Times New Roman" w:cs="Times New Roman" w:eastAsia="Times New Roman"/>
+                <w:b w:val="0"/>
                 <w:sz w:val="24"/>
               </w:rPr>
               <w:t>Register_ValidRequest_ShouldCreateUser</w:t>
@@ -603,7 +561,6 @@
         <w:tc>
           <w:tcPr>
             <w:tcW w:type="dxa" w:w="3230"/>
-            <w:vAlign w:val="center"/>
           </w:tcPr>
           <w:p>
             <w:pPr>
@@ -611,7 +568,8 @@
             </w:pPr>
             <w:r>
               <w:rPr>
-                <w:rFonts w:ascii="Times New Roman" w:hAnsi="Times New Roman"/>
+                <w:rFonts w:ascii="Times New Roman" w:hAnsi="Times New Roman" w:cs="Times New Roman" w:eastAsia="Times New Roman"/>
+                <w:b w:val="0"/>
                 <w:sz w:val="24"/>
               </w:rPr>
               <w:t>Пройден</w:t>
@@ -623,7 +581,6 @@
         <w:tc>
           <w:tcPr>
             <w:tcW w:type="dxa" w:w="3230"/>
-            <w:vAlign w:val="center"/>
           </w:tcPr>
           <w:p>
             <w:pPr>
@@ -631,7 +588,8 @@
             </w:pPr>
             <w:r>
               <w:rPr>
-                <w:rFonts w:ascii="Times New Roman" w:hAnsi="Times New Roman"/>
+                <w:rFonts w:ascii="Times New Roman" w:hAnsi="Times New Roman" w:cs="Times New Roman" w:eastAsia="Times New Roman"/>
+                <w:b w:val="0"/>
                 <w:sz w:val="24"/>
               </w:rPr>
               <w:t>2</w:t>
@@ -641,7 +599,6 @@
         <w:tc>
           <w:tcPr>
             <w:tcW w:type="dxa" w:w="3230"/>
-            <w:vAlign w:val="center"/>
           </w:tcPr>
           <w:p>
             <w:pPr>
@@ -649,7 +606,8 @@
             </w:pPr>
             <w:r>
               <w:rPr>
-                <w:rFonts w:ascii="Times New Roman" w:hAnsi="Times New Roman"/>
+                <w:rFonts w:ascii="Times New Roman" w:hAnsi="Times New Roman" w:cs="Times New Roman" w:eastAsia="Times New Roman"/>
+                <w:b w:val="0"/>
                 <w:sz w:val="24"/>
               </w:rPr>
               <w:t>GetProductById_ReturnsProductDetail</w:t>
@@ -659,7 +617,6 @@
         <w:tc>
           <w:tcPr>
             <w:tcW w:type="dxa" w:w="3230"/>
-            <w:vAlign w:val="center"/>
           </w:tcPr>
           <w:p>
             <w:pPr>
@@ -667,7 +624,8 @@
             </w:pPr>
             <w:r>
               <w:rPr>
-                <w:rFonts w:ascii="Times New Roman" w:hAnsi="Times New Roman"/>
+                <w:rFonts w:ascii="Times New Roman" w:hAnsi="Times New Roman" w:cs="Times New Roman" w:eastAsia="Times New Roman"/>
+                <w:b w:val="0"/>
                 <w:sz w:val="24"/>
               </w:rPr>
               <w:t>Пройден</w:t>
@@ -679,7 +637,6 @@
         <w:tc>
           <w:tcPr>
             <w:tcW w:type="dxa" w:w="3230"/>
-            <w:vAlign w:val="center"/>
           </w:tcPr>
           <w:p>
             <w:pPr>
@@ -687,7 +644,8 @@
             </w:pPr>
             <w:r>
               <w:rPr>
-                <w:rFonts w:ascii="Times New Roman" w:hAnsi="Times New Roman"/>
+                <w:rFonts w:ascii="Times New Roman" w:hAnsi="Times New Roman" w:cs="Times New Roman" w:eastAsia="Times New Roman"/>
+                <w:b w:val="0"/>
                 <w:sz w:val="24"/>
               </w:rPr>
               <w:t>3</w:t>
@@ -697,7 +655,6 @@
         <w:tc>
           <w:tcPr>
             <w:tcW w:type="dxa" w:w="3230"/>
-            <w:vAlign w:val="center"/>
           </w:tcPr>
           <w:p>
             <w:pPr>
@@ -705,7 +662,8 @@
             </w:pPr>
             <w:r>
               <w:rPr>
-                <w:rFonts w:ascii="Times New Roman" w:hAnsi="Times New Roman"/>
+                <w:rFonts w:ascii="Times New Roman" w:hAnsi="Times New Roman" w:cs="Times New Roman" w:eastAsia="Times New Roman"/>
+                <w:b w:val="0"/>
                 <w:sz w:val="24"/>
               </w:rPr>
               <w:t>CreateOrder_ValidRequest_ShouldCreateOrder</w:t>
@@ -715,7 +673,6 @@
         <w:tc>
           <w:tcPr>
             <w:tcW w:type="dxa" w:w="3230"/>
-            <w:vAlign w:val="center"/>
           </w:tcPr>
           <w:p>
             <w:pPr>
@@ -723,7 +680,8 @@
             </w:pPr>
             <w:r>
               <w:rPr>
-                <w:rFonts w:ascii="Times New Roman" w:hAnsi="Times New Roman"/>
+                <w:rFonts w:ascii="Times New Roman" w:hAnsi="Times New Roman" w:cs="Times New Roman" w:eastAsia="Times New Roman"/>
+                <w:b w:val="0"/>
                 <w:sz w:val="24"/>
               </w:rPr>
               <w:t>Пройден</w:t>
@@ -735,7 +693,6 @@
         <w:tc>
           <w:tcPr>
             <w:tcW w:type="dxa" w:w="3230"/>
-            <w:vAlign w:val="center"/>
           </w:tcPr>
           <w:p>
             <w:pPr>
@@ -743,7 +700,8 @@
             </w:pPr>
             <w:r>
               <w:rPr>
-                <w:rFonts w:ascii="Times New Roman" w:hAnsi="Times New Roman"/>
+                <w:rFonts w:ascii="Times New Roman" w:hAnsi="Times New Roman" w:cs="Times New Roman" w:eastAsia="Times New Roman"/>
+                <w:b w:val="0"/>
                 <w:sz w:val="24"/>
               </w:rPr>
               <w:t>4</w:t>
@@ -753,7 +711,6 @@
         <w:tc>
           <w:tcPr>
             <w:tcW w:type="dxa" w:w="3230"/>
-            <w:vAlign w:val="center"/>
           </w:tcPr>
           <w:p>
             <w:pPr>
@@ -761,7 +718,8 @@
             </w:pPr>
             <w:r>
               <w:rPr>
-                <w:rFonts w:ascii="Times New Roman" w:hAnsi="Times New Roman"/>
+                <w:rFonts w:ascii="Times New Roman" w:hAnsi="Times New Roman" w:cs="Times New Roman" w:eastAsia="Times New Roman"/>
+                <w:b w:val="0"/>
                 <w:sz w:val="24"/>
               </w:rPr>
               <w:t>CreateServiceRequest_ValidRequest</w:t>
@@ -771,7 +729,6 @@
         <w:tc>
           <w:tcPr>
             <w:tcW w:type="dxa" w:w="3230"/>
-            <w:vAlign w:val="center"/>
           </w:tcPr>
           <w:p>
             <w:pPr>
@@ -779,7 +736,8 @@
             </w:pPr>
             <w:r>
               <w:rPr>
-                <w:rFonts w:ascii="Times New Roman" w:hAnsi="Times New Roman"/>
+                <w:rFonts w:ascii="Times New Roman" w:hAnsi="Times New Roman" w:cs="Times New Roman" w:eastAsia="Times New Roman"/>
+                <w:b w:val="0"/>
                 <w:sz w:val="24"/>
               </w:rPr>
               <w:t>Пройден</w:t>
@@ -791,7 +749,6 @@
         <w:tc>
           <w:tcPr>
             <w:tcW w:type="dxa" w:w="3230"/>
-            <w:vAlign w:val="center"/>
           </w:tcPr>
           <w:p>
             <w:pPr>
@@ -799,7 +756,8 @@
             </w:pPr>
             <w:r>
               <w:rPr>
-                <w:rFonts w:ascii="Times New Roman" w:hAnsi="Times New Roman"/>
+                <w:rFonts w:ascii="Times New Roman" w:hAnsi="Times New Roman" w:cs="Times New Roman" w:eastAsia="Times New Roman"/>
+                <w:b w:val="0"/>
                 <w:sz w:val="24"/>
               </w:rPr>
               <w:t>5</w:t>
@@ -809,7 +767,6 @@
         <w:tc>
           <w:tcPr>
             <w:tcW w:type="dxa" w:w="3230"/>
-            <w:vAlign w:val="center"/>
           </w:tcPr>
           <w:p>
             <w:pPr>
@@ -817,7 +774,8 @@
             </w:pPr>
             <w:r>
               <w:rPr>
-                <w:rFonts w:ascii="Times New Roman" w:hAnsi="Times New Roman"/>
+                <w:rFonts w:ascii="Times New Roman" w:hAnsi="Times New Roman" w:cs="Times New Roman" w:eastAsia="Times New Roman"/>
+                <w:b w:val="0"/>
                 <w:sz w:val="24"/>
               </w:rPr>
               <w:t>CreateWarrantyClaim_ValidRequest</w:t>
@@ -827,7 +785,6 @@
         <w:tc>
           <w:tcPr>
             <w:tcW w:type="dxa" w:w="3230"/>
-            <w:vAlign w:val="center"/>
           </w:tcPr>
           <w:p>
             <w:pPr>
@@ -835,7 +792,8 @@
             </w:pPr>
             <w:r>
               <w:rPr>
-                <w:rFonts w:ascii="Times New Roman" w:hAnsi="Times New Roman"/>
+                <w:rFonts w:ascii="Times New Roman" w:hAnsi="Times New Roman" w:cs="Times New Roman" w:eastAsia="Times New Roman"/>
+                <w:b w:val="0"/>
                 <w:sz w:val="24"/>
               </w:rPr>
               <w:t>Пройден</w:t>
@@ -847,7 +805,6 @@
         <w:tc>
           <w:tcPr>
             <w:tcW w:type="dxa" w:w="3230"/>
-            <w:vAlign w:val="center"/>
           </w:tcPr>
           <w:p>
             <w:pPr>
@@ -855,7 +812,8 @@
             </w:pPr>
             <w:r>
               <w:rPr>
-                <w:rFonts w:ascii="Times New Roman" w:hAnsi="Times New Roman"/>
+                <w:rFonts w:ascii="Times New Roman" w:hAnsi="Times New Roman" w:cs="Times New Roman" w:eastAsia="Times New Roman"/>
+                <w:b w:val="0"/>
                 <w:sz w:val="24"/>
               </w:rPr>
               <w:t>6</w:t>
@@ -865,7 +823,6 @@
         <w:tc>
           <w:tcPr>
             <w:tcW w:type="dxa" w:w="3230"/>
-            <w:vAlign w:val="center"/>
           </w:tcPr>
           <w:p>
             <w:pPr>
@@ -873,7 +830,8 @@
             </w:pPr>
             <w:r>
               <w:rPr>
-                <w:rFonts w:ascii="Times New Roman" w:hAnsi="Times New Roman"/>
+                <w:rFonts w:ascii="Times New Roman" w:hAnsi="Times New Roman" w:cs="Times New Roman" w:eastAsia="Times New Roman"/>
+                <w:b w:val="0"/>
                 <w:sz w:val="24"/>
               </w:rPr>
               <w:t>CheckCompatibility_IncompatibleSocket</w:t>
@@ -883,7 +841,6 @@
         <w:tc>
           <w:tcPr>
             <w:tcW w:type="dxa" w:w="3230"/>
-            <w:vAlign w:val="center"/>
           </w:tcPr>
           <w:p>
             <w:pPr>
@@ -891,7 +848,8 @@
             </w:pPr>
             <w:r>
               <w:rPr>
-                <w:rFonts w:ascii="Times New Roman" w:hAnsi="Times New Roman"/>
+                <w:rFonts w:ascii="Times New Roman" w:hAnsi="Times New Roman" w:cs="Times New Roman" w:eastAsia="Times New Roman"/>
+                <w:b w:val="0"/>
                 <w:sz w:val="24"/>
               </w:rPr>
               <w:t>Пройден</w:t>
@@ -903,7 +861,6 @@
         <w:tc>
           <w:tcPr>
             <w:tcW w:type="dxa" w:w="3230"/>
-            <w:vAlign w:val="center"/>
           </w:tcPr>
           <w:p>
             <w:pPr>
@@ -911,7 +868,8 @@
             </w:pPr>
             <w:r>
               <w:rPr>
-                <w:rFonts w:ascii="Times New Roman" w:hAnsi="Times New Roman"/>
+                <w:rFonts w:ascii="Times New Roman" w:hAnsi="Times New Roman" w:cs="Times New Roman" w:eastAsia="Times New Roman"/>
+                <w:b w:val="0"/>
                 <w:sz w:val="24"/>
               </w:rPr>
               <w:t>7</w:t>
@@ -921,7 +879,6 @@
         <w:tc>
           <w:tcPr>
             <w:tcW w:type="dxa" w:w="3230"/>
-            <w:vAlign w:val="center"/>
           </w:tcPr>
           <w:p>
             <w:pPr>
@@ -929,7 +886,8 @@
             </w:pPr>
             <w:r>
               <w:rPr>
-                <w:rFonts w:ascii="Times New Roman" w:hAnsi="Times New Roman"/>
+                <w:rFonts w:ascii="Times New Roman" w:hAnsi="Times New Roman" w:cs="Times New Roman" w:eastAsia="Times New Roman"/>
+                <w:b w:val="0"/>
                 <w:sz w:val="24"/>
               </w:rPr>
               <w:t>ServicesShouldHaveInterfaces</w:t>
@@ -939,7 +897,6 @@
         <w:tc>
           <w:tcPr>
             <w:tcW w:type="dxa" w:w="3230"/>
-            <w:vAlign w:val="center"/>
           </w:tcPr>
           <w:p>
             <w:pPr>
@@ -947,7 +904,8 @@
             </w:pPr>
             <w:r>
               <w:rPr>
-                <w:rFonts w:ascii="Times New Roman" w:hAnsi="Times New Roman"/>
+                <w:rFonts w:ascii="Times New Roman" w:hAnsi="Times New Roman" w:cs="Times New Roman" w:eastAsia="Times New Roman"/>
+                <w:b w:val="0"/>
                 <w:sz w:val="24"/>
               </w:rPr>
               <w:t>Пройден</w:t>
@@ -958,20 +916,14 @@
     </w:tbl>
     <w:p>
       <w:pPr>
-        <w:spacing w:line="240" w:lineRule="auto" w:before="0" w:after="0"/>
+        <w:spacing w:before="0" w:after="0"/>
+        <w:ind w:firstLine="0"/>
         <w:jc w:val="both"/>
       </w:pPr>
-      <w:r>
-        <w:rPr>
-          <w:rFonts w:ascii="Times New Roman" w:hAnsi="Times New Roman" w:cs="Times New Roman" w:eastAsia="Times New Roman"/>
-          <w:b w:val="0"/>
-          <w:sz w:val="28"/>
-        </w:rPr>
-      </w:r>
     </w:p>
     <w:p>
       <w:pPr>
-        <w:spacing w:line="240" w:lineRule="auto" w:before="0" w:after="0"/>
+        <w:spacing w:before="0" w:after="0"/>
         <w:ind w:firstLine="709"/>
         <w:jc w:val="both"/>
       </w:pPr>
@@ -986,7 +938,8 @@
     </w:p>
     <w:p>
       <w:pPr>
-        <w:spacing w:line="240" w:lineRule="auto" w:before="240" w:after="240"/>
+        <w:spacing w:before="240" w:after="240"/>
+        <w:ind w:firstLine="0"/>
         <w:jc w:val="left"/>
       </w:pPr>
       <w:r>
@@ -1000,7 +953,7 @@
     </w:p>
     <w:p>
       <w:pPr>
-        <w:spacing w:line="240" w:lineRule="auto" w:before="0" w:after="0"/>
+        <w:spacing w:before="0" w:after="0"/>
         <w:ind w:firstLine="709"/>
         <w:jc w:val="both"/>
       </w:pPr>
@@ -1387,7 +1340,7 @@
     <w:qFormat/>
     <w:rsid w:val="00FC693F"/>
     <w:rPr>
-      <w:rFonts w:ascii="Times New Roman" w:hAnsi="Times New Roman" w:cs="Times New Roman" w:eastAsia="Times New Roman"/>
+      <w:rFonts w:ascii="Times New Roman" w:hAnsi="Times New Roman"/>
       <w:sz w:val="28"/>
     </w:rPr>
   </w:style>

</xml_diff>